<commit_message>
fix: improve light mode readability and theme contrast
</commit_message>
<xml_diff>
--- a/FORM connect/bank-general.docx
+++ b/FORM connect/bank-general.docx
@@ -132,7 +132,8 @@
         <w:rPr>
           <w:rFonts w:ascii="TH SarabunPSK" w:hAnsi="TH SarabunPSK" w:cs="TH SarabunPSK"/>
           <w:color w:val="000000"/>
-          <w:sz w:val="28"/>
+          <w:sz w:val="32"/>
+          <w:szCs w:val="32"/>
         </w:rPr>
       </w:pPr>
       <w:r>
@@ -141,7 +142,8 @@
           <w:b/>
           <w:bCs/>
           <w:color w:val="000000"/>
-          <w:sz w:val="28"/>
+          <w:sz w:val="32"/>
+          <w:szCs w:val="32"/>
           <w:cs/>
         </w:rPr>
         <w:t>หมายเรียกพยานเ</w:t>
@@ -152,7 +154,8 @@
           <w:b/>
           <w:bCs/>
           <w:color w:val="000000"/>
-          <w:sz w:val="28"/>
+          <w:sz w:val="32"/>
+          <w:szCs w:val="32"/>
           <w:cs/>
           <w:lang w:val="th-TH"/>
         </w:rPr>
@@ -1016,15 +1019,7 @@
           <w:sz w:val="32"/>
           <w:szCs w:val="32"/>
         </w:rPr>
-        <w:t>}}</w:t>
-      </w:r>
-      <w:r>
-        <w:rPr>
-          <w:rFonts w:ascii="TH SarabunPSK" w:hAnsi="TH SarabunPSK" w:cs="TH SarabunPSK"/>
-          <w:sz w:val="32"/>
-          <w:szCs w:val="32"/>
-        </w:rPr>
-        <w:t xml:space="preserve"> </w:t>
+        <w:t xml:space="preserve">}} </w:t>
       </w:r>
       <w:proofErr w:type="spellStart"/>
       <w:r>
@@ -4841,27 +4836,27 @@
 </file>
 
 <file path=customXml/item1.xml><?xml version="1.0" encoding="utf-8"?>
+<b:Sources xmlns:b="http://schemas.openxmlformats.org/officeDocument/2006/bibliography" xmlns="http://schemas.openxmlformats.org/officeDocument/2006/bibliography" SelectedStyle="\APA.XSL" StyleName="APA"/>
+</file>
+
+<file path=customXml/item2.xml><?xml version="1.0" encoding="utf-8"?>
 <ControlsStorage xmlns="urn:schemas-microsoft-com.VSTO2008Demos.ControlsStorage">
   <Controls>AAEAAAD/////AQAAAAAAAAAMAgAAAEVDaGVtNFdvcmQuQ29yZSwgVmVyc2lvbj0xLjAuMC4wLCBDdWx0dXJlPW5ldXRyYWwsIFB1YmxpY0tleVRva2VuPW51bGwHAQAAAAABAAAAAAAAAAQgQ2hlbTRXb3JkLkNvcmUuQ29udHJvbFByb3BlcnRpZXMCAAAACw==</Controls>
 </ControlsStorage>
 </file>
 
-<file path=customXml/item2.xml><?xml version="1.0" encoding="utf-8"?>
-<b:Sources xmlns:b="http://schemas.openxmlformats.org/officeDocument/2006/bibliography" xmlns="http://schemas.openxmlformats.org/officeDocument/2006/bibliography" SelectedStyle="\APA.XSL" StyleName="APA"/>
+<file path=customXml/itemProps1.xml><?xml version="1.0" encoding="utf-8"?>
+<ds:datastoreItem xmlns:ds="http://schemas.openxmlformats.org/officeDocument/2006/customXml" ds:itemID="{021FF160-36C5-44A4-BF3B-03EF01514F95}">
+  <ds:schemaRefs>
+    <ds:schemaRef ds:uri="http://schemas.openxmlformats.org/officeDocument/2006/bibliography"/>
+  </ds:schemaRefs>
+</ds:datastoreItem>
 </file>
 
-<file path=customXml/itemProps1.xml><?xml version="1.0" encoding="utf-8"?>
+<file path=customXml/itemProps2.xml><?xml version="1.0" encoding="utf-8"?>
 <ds:datastoreItem xmlns:ds="http://schemas.openxmlformats.org/officeDocument/2006/customXml" ds:itemID="{387F2C84-EB35-4989-8999-B160505D29DD}">
   <ds:schemaRefs>
     <ds:schemaRef ds:uri="urn:schemas-microsoft-com.VSTO2008Demos.ControlsStorage"/>
   </ds:schemaRefs>
 </ds:datastoreItem>
-</file>
-
-<file path=customXml/itemProps2.xml><?xml version="1.0" encoding="utf-8"?>
-<ds:datastoreItem xmlns:ds="http://schemas.openxmlformats.org/officeDocument/2006/customXml" ds:itemID="{021FF160-36C5-44A4-BF3B-03EF01514F95}">
-  <ds:schemaRefs>
-    <ds:schemaRef ds:uri="http://schemas.openxmlformats.org/officeDocument/2006/bibliography"/>
-  </ds:schemaRefs>
-</ds:datastoreItem>
 </file>
</xml_diff>